<commit_message>
Propaga discussão atualizada (referências recentes) ao Documento completo e à Síntese
- Documento completo (HTML/PDF/Word): discussão do desacoplamento reforçada com
  Duignan et al. (2020) + equivalência TOST; relevância da fadiga mental
  (Yuan et al., 2023; Grgic et al., 2022). Conclusão reescrita em 5 pontos.
- Síntese: +4 cards de achados (RCI/MDC, equivalência TOST, rede psicométrica,
  cinética intradia); subtítulo atualizado; referências 78→81 (auto).

Co-Authored-By: Claude Opus 4.8 <noreply@anthropic.com>
Claude-Session: https://claude.ai/code/session_0157sZ1CmW4MRSmx6a9GoYrN
</commit_message>
<xml_diff>
--- a/auditoria_brums_hiit/tese/Documento_completo_BRUMS_HIIT.docx
+++ b/auditoria_brums_hiit/tese/Documento_completo_BRUMS_HIIT.docx
@@ -20699,7 +20699,25 @@
         <w:t>Como PSE, TRIMP e FC se relacionam com o perfil de humor?</w:t>
       </w:r>
       <w:r>
-        <w:t xml:space="preserve"> Fracamente e sem sobreviver à correção — a carga interna define o quanto se treina, mas o humor carrega informação adicional que a carga objetiva não vê; daí a superioridade das medidas subjetivas no monitoramento da resposta ao treino (Saw, Main &amp; Gastin, 2016).</w:t>
+        <w:t xml:space="preserve"> Fracamente e sem sobreviver à correção — a carga interna define o quanto se treina, mas o humor carrega informação adicional que a carga objetiva não vê; daí a superioridade das medidas subjetivas no monitoramento da resposta ao treino (Saw, Main &amp; Gastin, 2016). Esse desacoplamento não é peculiaridade da amostra: uma revisão sistemática recente de autorrelatos de item único em esportes coletivos encontrou associações com a carga que vão de nulas a, no máximo, moderadas (Duignan et al., 2020); e nossos </w:t>
+      </w:r>
+      <w:r>
+        <w:rPr>
+          <w:b/>
+        </w:rPr>
+        <w:t>testes de equivalência (TOST)</w:t>
+      </w:r>
+      <w:r>
+        <w:t xml:space="preserve"> formalizam o ponto — para os índices centrais, a associação carga↔humor e o contraste HIIT-vs-sem são estatisticamente </w:t>
+      </w:r>
+      <w:r>
+        <w:rPr>
+          <w:b/>
+        </w:rPr>
+        <w:t>equivalentes a zero</w:t>
+      </w:r>
+      <w:r>
+        <w:t>, não apenas "não significativos". A ênfase na fadiga — física e mental — tampouco é arbitrária: revisões e meta-análises recentes mostram que a fadiga mental prejudica de forma consistente o desempenho técnico e físico em esportes coletivos (Yuan et al., 2023; Grgic, Mikulic &amp; Mikulic, 2022), o que dá valor prático a um marcador sensível e confiável desse estado.</w:t>
       </w:r>
     </w:p>
     <w:p>
@@ -21133,7 +21151,97 @@
         <w:jc w:val="both"/>
       </w:pPr>
       <w:r>
-        <w:t>Os planos psicométrico e analítico convergem: a variável mais confiável e sem piso — a fadiga física — é também a de maior resposta aguda (dz≈1), maior acúmulo semanal e a única amplificada pelo HIIT no agudo. A resposta de humor ao microciclo é real, mora no eixo energia–fadiga, é fortemente individual e não é função simples do custo cardiovascular da sessão. Tudo respeitando a estrutura de medidas repetidas — a contribuição metodológica central do trabalho.</w:t>
+        <w:t xml:space="preserve">Os planos psicométrico e analítico convergem em cinco pontos. </w:t>
+      </w:r>
+      <w:r>
+        <w:rPr>
+          <w:b/>
+        </w:rPr>
+        <w:t>(1)</w:t>
+      </w:r>
+      <w:r>
+        <w:t xml:space="preserve"> A resposta mora no eixo energia–fadiga: a fadiga física — a variável mais confiável e sem piso — é a de maior resposta aguda (dz ≈ 1), maior acúmulo semanal e a única amplificada pelo HIIT no agudo; a inércia das negativas é efeito piso, não ausência de fenômeno. </w:t>
+      </w:r>
+      <w:r>
+        <w:rPr>
+          <w:b/>
+        </w:rPr>
+        <w:t>(2)</w:t>
+      </w:r>
+      <w:r>
+        <w:t xml:space="preserve"> É mudança de </w:t>
+      </w:r>
+      <w:r>
+        <w:rPr>
+          <w:b/>
+        </w:rPr>
+        <w:t>estado</w:t>
+      </w:r>
+      <w:r>
+        <w:t xml:space="preserve">, não de medida (invariância métrica sustentada; escalar aproximada; estrita no limite, com quebra local no "Sonolento"). </w:t>
+      </w:r>
+      <w:r>
+        <w:rPr>
+          <w:b/>
+        </w:rPr>
+        <w:t>(3)</w:t>
+      </w:r>
+      <w:r>
+        <w:t xml:space="preserve"> É </w:t>
+      </w:r>
+      <w:r>
+        <w:rPr>
+          <w:b/>
+        </w:rPr>
+        <w:t>fortemente individual</w:t>
+      </w:r>
+      <w:r>
+        <w:t xml:space="preserve"> — a maior parte da variância é traço e só uma minoria de atletas atinge mudança confiável (RCI acima da mínima mudança detectável), o que desqualifica decisões pela média do grupo. </w:t>
+      </w:r>
+      <w:r>
+        <w:rPr>
+          <w:b/>
+        </w:rPr>
+        <w:t>(4)</w:t>
+      </w:r>
+      <w:r>
+        <w:t xml:space="preserve"> O </w:t>
+      </w:r>
+      <w:r>
+        <w:rPr>
+          <w:b/>
+        </w:rPr>
+        <w:t>desacoplamento</w:t>
+      </w:r>
+      <w:r>
+        <w:t xml:space="preserve"> carga↔humor é formal (equivalência por TOST): FC/TRIMP não substituem o autorrelato (Saw et al., 2016; Duignan et al., 2020). </w:t>
+      </w:r>
+      <w:r>
+        <w:rPr>
+          <w:b/>
+        </w:rPr>
+        <w:t>(5)</w:t>
+      </w:r>
+      <w:r>
+        <w:t xml:space="preserve"> O monitoramento eficiente combina a </w:t>
+      </w:r>
+      <w:r>
+        <w:rPr>
+          <w:b/>
+        </w:rPr>
+        <w:t>fadiga física</w:t>
+      </w:r>
+      <w:r>
+        <w:t xml:space="preserve"> (sensibilidade) e a </w:t>
+      </w:r>
+      <w:r>
+        <w:rPr>
+          <w:b/>
+        </w:rPr>
+        <w:t>fadiga mental/depressão</w:t>
+      </w:r>
+      <w:r>
+        <w:t xml:space="preserve"> (confiabilidade) — marcadores cujo valor prático é reforçado pelo impacto da fadiga mental no desempenho (Yuan et al., 2023). Tudo respeitando a estrutura de medidas repetidas — a contribuição metodológica central do trabalho.</w:t>
       </w:r>
     </w:p>
     <w:p>

</xml_diff>

<commit_message>
Coerência cruzada: rastreabilidade dos números-âncora + integração ao Documento e Dashboard
- coerencia_cruzada.py (reproduzível): extrai o texto RENDERIZADO (Playwright) dos
  7 entregáveis e rastreia 14 números-âncora (dz, Tucker φ, ΔCFI, AUC, κ, RCI/TOST,
  HIIT FC/PSE, η²). Resultado: 90 ocorrências consistentes, sem divergências.
  resultados_coerencia.json.
- Documento completo (HTML/PDF/Word): nova subseção "Coerência entre entregáveis"
  (tabela dos números-âncora + nota) na seção de Reprodutibilidade.
- Dashboard: card "Coerência entre entregáveis" na aba Análises+.

Co-Authored-By: Claude Opus 4.8 <noreply@anthropic.com>
Claude-Session: https://claude.ai/code/session_0157sZ1CmW4MRSmx6a9GoYrN
</commit_message>
<xml_diff>
--- a/auditoria_brums_hiit/tese/Documento_completo_BRUMS_HIIT.docx
+++ b/auditoria_brums_hiit/tese/Documento_completo_BRUMS_HIIT.docx
@@ -21136,6 +21136,888 @@
           <w:sz w:val="17"/>
         </w:rPr>
         <w:t xml:space="preserve"> Início/Cron → ingestão → análises → carga interna → gráficos → exportação → app analista → relatório.</w:t>
+      </w:r>
+    </w:p>
+    <w:p>
+      <w:pPr>
+        <w:pStyle w:val="Heading2"/>
+      </w:pPr>
+      <w:r>
+        <w:t>Coerência entre entregáveis</w:t>
+      </w:r>
+    </w:p>
+    <w:p>
+      <w:pPr>
+        <w:jc w:val="both"/>
+      </w:pPr>
+      <w:r>
+        <w:t xml:space="preserve">Como todos os entregáveis são gerados por código a partir da </w:t>
+      </w:r>
+      <w:r>
+        <w:rPr>
+          <w:b/>
+        </w:rPr>
+        <w:t>mesma fonte</w:t>
+      </w:r>
+      <w:r>
+        <w:t xml:space="preserve"> (as bases reproduzidas e os JSON dos módulos), os números-chave são idênticos por construção. Uma verificação de </w:t>
+      </w:r>
+      <w:r>
+        <w:rPr>
+          <w:b/>
+        </w:rPr>
+        <w:t>coerência cruzada</w:t>
+      </w:r>
+      <w:r>
+        <w:t xml:space="preserve"> rastreou 14 números-âncora nos sete entregáveis (artigo, documento, manuscrito, central, dashboard, showcase e síntese), confirmando 90 ocorrências </w:t>
+      </w:r>
+      <w:r>
+        <w:rPr>
+          <w:b/>
+        </w:rPr>
+        <w:t>consistentes</w:t>
+      </w:r>
+      <w:r>
+        <w:t>, sem divergências — as ausências correspondem apenas a métricas não citadas naquele material (não a valores conflitantes).</w:t>
+      </w:r>
+    </w:p>
+    <w:tbl>
+      <w:tblPr>
+        <w:tblStyle w:val="LightGrid-Accent1"/>
+        <w:tblW w:type="auto" w:w="0"/>
+        <w:jc w:val="center"/>
+        <w:tblLook w:firstColumn="1" w:firstRow="1" w:lastColumn="0" w:lastRow="0" w:noHBand="0" w:noVBand="1" w:val="04A0"/>
+      </w:tblPr>
+      <w:tblGrid>
+        <w:gridCol w:w="3289"/>
+        <w:gridCol w:w="3289"/>
+        <w:gridCol w:w="3289"/>
+      </w:tblGrid>
+      <w:tr>
+        <w:tc>
+          <w:tcPr>
+            <w:tcW w:type="dxa" w:w="3289"/>
+          </w:tcPr>
+          <w:p>
+            <w:pPr>
+              <w:jc w:val="left"/>
+            </w:pPr>
+            <w:r/>
+            <w:r>
+              <w:rPr>
+                <w:b/>
+                <w:sz w:val="18"/>
+              </w:rPr>
+              <w:t>Métrica-âncora</w:t>
+            </w:r>
+          </w:p>
+        </w:tc>
+        <w:tc>
+          <w:tcPr>
+            <w:tcW w:type="dxa" w:w="3289"/>
+          </w:tcPr>
+          <w:p>
+            <w:pPr>
+              <w:jc w:val="center"/>
+            </w:pPr>
+            <w:r/>
+            <w:r>
+              <w:rPr>
+                <w:b/>
+                <w:sz w:val="18"/>
+              </w:rPr>
+              <w:t>Valor</w:t>
+            </w:r>
+          </w:p>
+        </w:tc>
+        <w:tc>
+          <w:tcPr>
+            <w:tcW w:type="dxa" w:w="3289"/>
+          </w:tcPr>
+          <w:p>
+            <w:pPr>
+              <w:jc w:val="center"/>
+            </w:pPr>
+            <w:r/>
+            <w:r>
+              <w:rPr>
+                <w:b/>
+                <w:sz w:val="18"/>
+              </w:rPr>
+              <w:t>Entregáveis que citam</w:t>
+            </w:r>
+          </w:p>
+        </w:tc>
+      </w:tr>
+      <w:tr>
+        <w:tc>
+          <w:tcPr>
+            <w:tcW w:type="dxa" w:w="3289"/>
+          </w:tcPr>
+          <w:p>
+            <w:pPr>
+              <w:jc w:val="left"/>
+            </w:pPr>
+            <w:r/>
+            <w:r>
+              <w:rPr>
+                <w:sz w:val="18"/>
+              </w:rPr>
+              <w:t>Fadiga física — dz agudo</w:t>
+            </w:r>
+          </w:p>
+        </w:tc>
+        <w:tc>
+          <w:tcPr>
+            <w:tcW w:type="dxa" w:w="3289"/>
+          </w:tcPr>
+          <w:p>
+            <w:pPr>
+              <w:jc w:val="center"/>
+            </w:pPr>
+            <w:r/>
+            <w:r>
+              <w:rPr>
+                <w:sz w:val="18"/>
+              </w:rPr>
+              <w:t>1,06</w:t>
+            </w:r>
+          </w:p>
+        </w:tc>
+        <w:tc>
+          <w:tcPr>
+            <w:tcW w:type="dxa" w:w="3289"/>
+          </w:tcPr>
+          <w:p>
+            <w:pPr>
+              <w:jc w:val="center"/>
+            </w:pPr>
+            <w:r/>
+            <w:r>
+              <w:rPr>
+                <w:sz w:val="18"/>
+              </w:rPr>
+              <w:t>7/7 — Artigo A1, Documento, Manuscrito, Central, Showcase, Síntese, Dashboard</w:t>
+            </w:r>
+          </w:p>
+        </w:tc>
+      </w:tr>
+      <w:tr>
+        <w:tc>
+          <w:tcPr>
+            <w:tcW w:type="dxa" w:w="3289"/>
+          </w:tcPr>
+          <w:p>
+            <w:pPr>
+              <w:jc w:val="left"/>
+            </w:pPr>
+            <w:r/>
+            <w:r>
+              <w:rPr>
+                <w:sz w:val="18"/>
+              </w:rPr>
+              <w:t>PTH — dz agudo</w:t>
+            </w:r>
+          </w:p>
+        </w:tc>
+        <w:tc>
+          <w:tcPr>
+            <w:tcW w:type="dxa" w:w="3289"/>
+          </w:tcPr>
+          <w:p>
+            <w:pPr>
+              <w:jc w:val="center"/>
+            </w:pPr>
+            <w:r/>
+            <w:r>
+              <w:rPr>
+                <w:sz w:val="18"/>
+              </w:rPr>
+              <w:t>0,68</w:t>
+            </w:r>
+          </w:p>
+        </w:tc>
+        <w:tc>
+          <w:tcPr>
+            <w:tcW w:type="dxa" w:w="3289"/>
+          </w:tcPr>
+          <w:p>
+            <w:pPr>
+              <w:jc w:val="center"/>
+            </w:pPr>
+            <w:r/>
+            <w:r>
+              <w:rPr>
+                <w:sz w:val="18"/>
+              </w:rPr>
+              <w:t>7/7 — Artigo A1, Documento, Manuscrito, Central, Showcase, Síntese, Dashboard</w:t>
+            </w:r>
+          </w:p>
+        </w:tc>
+      </w:tr>
+      <w:tr>
+        <w:tc>
+          <w:tcPr>
+            <w:tcW w:type="dxa" w:w="3289"/>
+          </w:tcPr>
+          <w:p>
+            <w:pPr>
+              <w:jc w:val="left"/>
+            </w:pPr>
+            <w:r/>
+            <w:r>
+              <w:rPr>
+                <w:sz w:val="18"/>
+              </w:rPr>
+              <w:t>Vigor — dz agudo</w:t>
+            </w:r>
+          </w:p>
+        </w:tc>
+        <w:tc>
+          <w:tcPr>
+            <w:tcW w:type="dxa" w:w="3289"/>
+          </w:tcPr>
+          <w:p>
+            <w:pPr>
+              <w:jc w:val="center"/>
+            </w:pPr>
+            <w:r/>
+            <w:r>
+              <w:rPr>
+                <w:sz w:val="18"/>
+              </w:rPr>
+              <w:t>0,56</w:t>
+            </w:r>
+          </w:p>
+        </w:tc>
+        <w:tc>
+          <w:tcPr>
+            <w:tcW w:type="dxa" w:w="3289"/>
+          </w:tcPr>
+          <w:p>
+            <w:pPr>
+              <w:jc w:val="center"/>
+            </w:pPr>
+            <w:r/>
+            <w:r>
+              <w:rPr>
+                <w:sz w:val="18"/>
+              </w:rPr>
+              <w:t>7/7 — Artigo A1, Documento, Manuscrito, Central, Showcase, Síntese, Dashboard</w:t>
+            </w:r>
+          </w:p>
+        </w:tc>
+      </w:tr>
+      <w:tr>
+        <w:tc>
+          <w:tcPr>
+            <w:tcW w:type="dxa" w:w="3289"/>
+          </w:tcPr>
+          <w:p>
+            <w:pPr>
+              <w:jc w:val="left"/>
+            </w:pPr>
+            <w:r/>
+            <w:r>
+              <w:rPr>
+                <w:sz w:val="18"/>
+              </w:rPr>
+              <w:t>Tucker φ (multigrupo)</w:t>
+            </w:r>
+          </w:p>
+        </w:tc>
+        <w:tc>
+          <w:tcPr>
+            <w:tcW w:type="dxa" w:w="3289"/>
+          </w:tcPr>
+          <w:p>
+            <w:pPr>
+              <w:jc w:val="center"/>
+            </w:pPr>
+            <w:r/>
+            <w:r>
+              <w:rPr>
+                <w:sz w:val="18"/>
+              </w:rPr>
+              <w:t>0,992</w:t>
+            </w:r>
+          </w:p>
+        </w:tc>
+        <w:tc>
+          <w:tcPr>
+            <w:tcW w:type="dxa" w:w="3289"/>
+          </w:tcPr>
+          <w:p>
+            <w:pPr>
+              <w:jc w:val="center"/>
+            </w:pPr>
+            <w:r/>
+            <w:r>
+              <w:rPr>
+                <w:sz w:val="18"/>
+              </w:rPr>
+              <w:t>5/7 — Artigo A1, Documento, Central, Showcase, Dashboard</w:t>
+            </w:r>
+          </w:p>
+        </w:tc>
+      </w:tr>
+      <w:tr>
+        <w:tc>
+          <w:tcPr>
+            <w:tcW w:type="dxa" w:w="3289"/>
+          </w:tcPr>
+          <w:p>
+            <w:pPr>
+              <w:jc w:val="left"/>
+            </w:pPr>
+            <w:r/>
+            <w:r>
+              <w:rPr>
+                <w:sz w:val="18"/>
+              </w:rPr>
+              <w:t>ΔCFI métrico conjunto</w:t>
+            </w:r>
+          </w:p>
+        </w:tc>
+        <w:tc>
+          <w:tcPr>
+            <w:tcW w:type="dxa" w:w="3289"/>
+          </w:tcPr>
+          <w:p>
+            <w:pPr>
+              <w:jc w:val="center"/>
+            </w:pPr>
+            <w:r/>
+            <w:r>
+              <w:rPr>
+                <w:sz w:val="18"/>
+              </w:rPr>
+              <w:t>0,004</w:t>
+            </w:r>
+          </w:p>
+        </w:tc>
+        <w:tc>
+          <w:tcPr>
+            <w:tcW w:type="dxa" w:w="3289"/>
+          </w:tcPr>
+          <w:p>
+            <w:pPr>
+              <w:jc w:val="center"/>
+            </w:pPr>
+            <w:r/>
+            <w:r>
+              <w:rPr>
+                <w:sz w:val="18"/>
+              </w:rPr>
+              <w:t>7/7 — Artigo A1, Documento, Manuscrito, Central, Showcase, Síntese, Dashboard</w:t>
+            </w:r>
+          </w:p>
+        </w:tc>
+      </w:tr>
+      <w:tr>
+        <w:tc>
+          <w:tcPr>
+            <w:tcW w:type="dxa" w:w="3289"/>
+          </w:tcPr>
+          <w:p>
+            <w:pPr>
+              <w:jc w:val="left"/>
+            </w:pPr>
+            <w:r/>
+            <w:r>
+              <w:rPr>
+                <w:sz w:val="18"/>
+              </w:rPr>
+              <w:t>Invariância estrita — ΔCFI</w:t>
+            </w:r>
+          </w:p>
+        </w:tc>
+        <w:tc>
+          <w:tcPr>
+            <w:tcW w:type="dxa" w:w="3289"/>
+          </w:tcPr>
+          <w:p>
+            <w:pPr>
+              <w:jc w:val="center"/>
+            </w:pPr>
+            <w:r/>
+            <w:r>
+              <w:rPr>
+                <w:sz w:val="18"/>
+              </w:rPr>
+              <w:t>0,015</w:t>
+            </w:r>
+          </w:p>
+        </w:tc>
+        <w:tc>
+          <w:tcPr>
+            <w:tcW w:type="dxa" w:w="3289"/>
+          </w:tcPr>
+          <w:p>
+            <w:pPr>
+              <w:jc w:val="center"/>
+            </w:pPr>
+            <w:r/>
+            <w:r>
+              <w:rPr>
+                <w:sz w:val="18"/>
+              </w:rPr>
+              <w:t>7/7 — Artigo A1, Documento, Manuscrito, Central, Showcase, Síntese, Dashboard</w:t>
+            </w:r>
+          </w:p>
+        </w:tc>
+      </w:tr>
+      <w:tr>
+        <w:tc>
+          <w:tcPr>
+            <w:tcW w:type="dxa" w:w="3289"/>
+          </w:tcPr>
+          <w:p>
+            <w:pPr>
+              <w:jc w:val="left"/>
+            </w:pPr>
+            <w:r/>
+            <w:r>
+              <w:rPr>
+                <w:sz w:val="18"/>
+              </w:rPr>
+              <w:t>Parcial — viés residual</w:t>
+            </w:r>
+          </w:p>
+        </w:tc>
+        <w:tc>
+          <w:tcPr>
+            <w:tcW w:type="dxa" w:w="3289"/>
+          </w:tcPr>
+          <w:p>
+            <w:pPr>
+              <w:jc w:val="center"/>
+            </w:pPr>
+            <w:r/>
+            <w:r>
+              <w:rPr>
+                <w:sz w:val="18"/>
+              </w:rPr>
+              <w:t>0,064</w:t>
+            </w:r>
+          </w:p>
+        </w:tc>
+        <w:tc>
+          <w:tcPr>
+            <w:tcW w:type="dxa" w:w="3289"/>
+          </w:tcPr>
+          <w:p>
+            <w:pPr>
+              <w:jc w:val="center"/>
+            </w:pPr>
+            <w:r/>
+            <w:r>
+              <w:rPr>
+                <w:sz w:val="18"/>
+              </w:rPr>
+              <w:t>5/7 — Artigo A1, Documento, Central, Showcase, Dashboard</w:t>
+            </w:r>
+          </w:p>
+        </w:tc>
+      </w:tr>
+      <w:tr>
+        <w:tc>
+          <w:tcPr>
+            <w:tcW w:type="dxa" w:w="3289"/>
+          </w:tcPr>
+          <w:p>
+            <w:pPr>
+              <w:jc w:val="left"/>
+            </w:pPr>
+            <w:r/>
+            <w:r>
+              <w:rPr>
+                <w:sz w:val="18"/>
+              </w:rPr>
+              <w:t>Preditor fadiga física — AUC</w:t>
+            </w:r>
+          </w:p>
+        </w:tc>
+        <w:tc>
+          <w:tcPr>
+            <w:tcW w:type="dxa" w:w="3289"/>
+          </w:tcPr>
+          <w:p>
+            <w:pPr>
+              <w:jc w:val="center"/>
+            </w:pPr>
+            <w:r/>
+            <w:r>
+              <w:rPr>
+                <w:sz w:val="18"/>
+              </w:rPr>
+              <w:t>0,90</w:t>
+            </w:r>
+          </w:p>
+        </w:tc>
+        <w:tc>
+          <w:tcPr>
+            <w:tcW w:type="dxa" w:w="3289"/>
+          </w:tcPr>
+          <w:p>
+            <w:pPr>
+              <w:jc w:val="center"/>
+            </w:pPr>
+            <w:r/>
+            <w:r>
+              <w:rPr>
+                <w:sz w:val="18"/>
+              </w:rPr>
+              <w:t>7/7 — Artigo A1, Documento, Manuscrito, Central, Showcase, Síntese, Dashboard</w:t>
+            </w:r>
+          </w:p>
+        </w:tc>
+      </w:tr>
+      <w:tr>
+        <w:tc>
+          <w:tcPr>
+            <w:tcW w:type="dxa" w:w="3289"/>
+          </w:tcPr>
+          <w:p>
+            <w:pPr>
+              <w:jc w:val="left"/>
+            </w:pPr>
+            <w:r/>
+            <w:r>
+              <w:rPr>
+                <w:sz w:val="18"/>
+              </w:rPr>
+              <w:t>ROC pós vs. pré — AUC</w:t>
+            </w:r>
+          </w:p>
+        </w:tc>
+        <w:tc>
+          <w:tcPr>
+            <w:tcW w:type="dxa" w:w="3289"/>
+          </w:tcPr>
+          <w:p>
+            <w:pPr>
+              <w:jc w:val="center"/>
+            </w:pPr>
+            <w:r/>
+            <w:r>
+              <w:rPr>
+                <w:sz w:val="18"/>
+              </w:rPr>
+              <w:t>0,70</w:t>
+            </w:r>
+          </w:p>
+        </w:tc>
+        <w:tc>
+          <w:tcPr>
+            <w:tcW w:type="dxa" w:w="3289"/>
+          </w:tcPr>
+          <w:p>
+            <w:pPr>
+              <w:jc w:val="center"/>
+            </w:pPr>
+            <w:r/>
+            <w:r>
+              <w:rPr>
+                <w:sz w:val="18"/>
+              </w:rPr>
+              <w:t>7/7 — Artigo A1, Documento, Manuscrito, Central, Showcase, Síntese, Dashboard</w:t>
+            </w:r>
+          </w:p>
+        </w:tc>
+      </w:tr>
+      <w:tr>
+        <w:tc>
+          <w:tcPr>
+            <w:tcW w:type="dxa" w:w="3289"/>
+          </w:tcPr>
+          <w:p>
+            <w:pPr>
+              <w:jc w:val="left"/>
+            </w:pPr>
+            <w:r/>
+            <w:r>
+              <w:rPr>
+                <w:sz w:val="18"/>
+              </w:rPr>
+              <w:t>κ Fadiga (escalar)</w:t>
+            </w:r>
+          </w:p>
+        </w:tc>
+        <w:tc>
+          <w:tcPr>
+            <w:tcW w:type="dxa" w:w="3289"/>
+          </w:tcPr>
+          <w:p>
+            <w:pPr>
+              <w:jc w:val="center"/>
+            </w:pPr>
+            <w:r/>
+            <w:r>
+              <w:rPr>
+                <w:sz w:val="18"/>
+              </w:rPr>
+              <w:t>0,56</w:t>
+            </w:r>
+          </w:p>
+        </w:tc>
+        <w:tc>
+          <w:tcPr>
+            <w:tcW w:type="dxa" w:w="3289"/>
+          </w:tcPr>
+          <w:p>
+            <w:pPr>
+              <w:jc w:val="center"/>
+            </w:pPr>
+            <w:r/>
+            <w:r>
+              <w:rPr>
+                <w:sz w:val="18"/>
+              </w:rPr>
+              <w:t>7/7 — Artigo A1, Documento, Manuscrito, Central, Showcase, Síntese, Dashboard</w:t>
+            </w:r>
+          </w:p>
+        </w:tc>
+      </w:tr>
+      <w:tr>
+        <w:tc>
+          <w:tcPr>
+            <w:tcW w:type="dxa" w:w="3289"/>
+          </w:tcPr>
+          <w:p>
+            <w:pPr>
+              <w:jc w:val="left"/>
+            </w:pPr>
+            <w:r/>
+            <w:r>
+              <w:rPr>
+                <w:sz w:val="18"/>
+              </w:rPr>
+              <w:t>Iceberg pós</w:t>
+            </w:r>
+          </w:p>
+        </w:tc>
+        <w:tc>
+          <w:tcPr>
+            <w:tcW w:type="dxa" w:w="3289"/>
+          </w:tcPr>
+          <w:p>
+            <w:pPr>
+              <w:jc w:val="center"/>
+            </w:pPr>
+            <w:r/>
+            <w:r>
+              <w:rPr>
+                <w:sz w:val="18"/>
+              </w:rPr>
+              <w:t>75%</w:t>
+            </w:r>
+          </w:p>
+        </w:tc>
+        <w:tc>
+          <w:tcPr>
+            <w:tcW w:type="dxa" w:w="3289"/>
+          </w:tcPr>
+          <w:p>
+            <w:pPr>
+              <w:jc w:val="center"/>
+            </w:pPr>
+            <w:r/>
+            <w:r>
+              <w:rPr>
+                <w:sz w:val="18"/>
+              </w:rPr>
+              <w:t>5/7 — Documento, Manuscrito, Showcase, Síntese, Dashboard</w:t>
+            </w:r>
+          </w:p>
+        </w:tc>
+      </w:tr>
+      <w:tr>
+        <w:tc>
+          <w:tcPr>
+            <w:tcW w:type="dxa" w:w="3289"/>
+          </w:tcPr>
+          <w:p>
+            <w:pPr>
+              <w:jc w:val="left"/>
+            </w:pPr>
+            <w:r/>
+            <w:r>
+              <w:rPr>
+                <w:sz w:val="18"/>
+              </w:rPr>
+              <w:t>HIIT — FC de pico</w:t>
+            </w:r>
+          </w:p>
+        </w:tc>
+        <w:tc>
+          <w:tcPr>
+            <w:tcW w:type="dxa" w:w="3289"/>
+          </w:tcPr>
+          <w:p>
+            <w:pPr>
+              <w:jc w:val="center"/>
+            </w:pPr>
+            <w:r/>
+            <w:r>
+              <w:rPr>
+                <w:sz w:val="18"/>
+              </w:rPr>
+              <w:t>186</w:t>
+            </w:r>
+          </w:p>
+        </w:tc>
+        <w:tc>
+          <w:tcPr>
+            <w:tcW w:type="dxa" w:w="3289"/>
+          </w:tcPr>
+          <w:p>
+            <w:pPr>
+              <w:jc w:val="center"/>
+            </w:pPr>
+            <w:r/>
+            <w:r>
+              <w:rPr>
+                <w:sz w:val="18"/>
+              </w:rPr>
+              <w:t>7/7 — Artigo A1, Documento, Manuscrito, Central, Showcase, Síntese, Dashboard</w:t>
+            </w:r>
+          </w:p>
+        </w:tc>
+      </w:tr>
+      <w:tr>
+        <w:tc>
+          <w:tcPr>
+            <w:tcW w:type="dxa" w:w="3289"/>
+          </w:tcPr>
+          <w:p>
+            <w:pPr>
+              <w:jc w:val="left"/>
+            </w:pPr>
+            <w:r/>
+            <w:r>
+              <w:rPr>
+                <w:sz w:val="18"/>
+              </w:rPr>
+              <w:t>HIIT — PSE final</w:t>
+            </w:r>
+          </w:p>
+        </w:tc>
+        <w:tc>
+          <w:tcPr>
+            <w:tcW w:type="dxa" w:w="3289"/>
+          </w:tcPr>
+          <w:p>
+            <w:pPr>
+              <w:jc w:val="center"/>
+            </w:pPr>
+            <w:r/>
+            <w:r>
+              <w:rPr>
+                <w:sz w:val="18"/>
+              </w:rPr>
+              <w:t>9,9</w:t>
+            </w:r>
+          </w:p>
+        </w:tc>
+        <w:tc>
+          <w:tcPr>
+            <w:tcW w:type="dxa" w:w="3289"/>
+          </w:tcPr>
+          <w:p>
+            <w:pPr>
+              <w:jc w:val="center"/>
+            </w:pPr>
+            <w:r/>
+            <w:r>
+              <w:rPr>
+                <w:sz w:val="18"/>
+              </w:rPr>
+              <w:t>5/7 — Artigo A1, Documento, Central, Showcase, Dashboard</w:t>
+            </w:r>
+          </w:p>
+        </w:tc>
+      </w:tr>
+      <w:tr>
+        <w:tc>
+          <w:tcPr>
+            <w:tcW w:type="dxa" w:w="3289"/>
+          </w:tcPr>
+          <w:p>
+            <w:pPr>
+              <w:jc w:val="left"/>
+            </w:pPr>
+            <w:r/>
+            <w:r>
+              <w:rPr>
+                <w:sz w:val="18"/>
+              </w:rPr>
+              <w:t>Segmentação (η² PTH)</w:t>
+            </w:r>
+          </w:p>
+        </w:tc>
+        <w:tc>
+          <w:tcPr>
+            <w:tcW w:type="dxa" w:w="3289"/>
+          </w:tcPr>
+          <w:p>
+            <w:pPr>
+              <w:jc w:val="center"/>
+            </w:pPr>
+            <w:r/>
+            <w:r>
+              <w:rPr>
+                <w:sz w:val="18"/>
+              </w:rPr>
+              <w:t>0,70</w:t>
+            </w:r>
+          </w:p>
+        </w:tc>
+        <w:tc>
+          <w:tcPr>
+            <w:tcW w:type="dxa" w:w="3289"/>
+          </w:tcPr>
+          <w:p>
+            <w:pPr>
+              <w:jc w:val="center"/>
+            </w:pPr>
+            <w:r/>
+            <w:r>
+              <w:rPr>
+                <w:sz w:val="18"/>
+              </w:rPr>
+              <w:t>7/7 — Artigo A1, Documento, Manuscrito, Central, Showcase, Síntese, Dashboard</w:t>
+            </w:r>
+          </w:p>
+        </w:tc>
+      </w:tr>
+    </w:tbl>
+    <w:p>
+      <w:pPr>
+        <w:spacing w:after="40"/>
+      </w:pPr>
+    </w:p>
+    <w:p>
+      <w:pPr>
+        <w:jc w:val="both"/>
+      </w:pPr>
+      <w:r>
+        <w:t xml:space="preserve">Divergências aparentes entre módulos correspondem a </w:t>
+      </w:r>
+      <w:r>
+        <w:rPr>
+          <w:b/>
+        </w:rPr>
+        <w:t>índices distintos</w:t>
+      </w:r>
+      <w:r>
+        <w:t xml:space="preserve"> (ex.: a congruência de Tucker φ do módulo de confiabilidade, 0,987, e a do multigrupo, 0,992), e não a inconsistências. Reproduzível: </w:t>
+      </w:r>
+      <w:r>
+        <w:t>python coerencia_cruzada.py</w:t>
+      </w:r>
+      <w:r>
+        <w:t>.</w:t>
       </w:r>
     </w:p>
     <w:p>

</xml_diff>